<commit_message>
Cite the Alipay payment certificate in the orthodontics refiling
The 2026-09-15 and 2026-10-14 returns asked for a payment voucher showing
the plaintiff's name and for a current date on the complaint.

- 民事起诉状: 落款日期 moved to 2026-10-16; the payment paragraph now gives
  the Alipay transaction order number and the funding card
- 证据目录: certificate added as 证据2, later items renumbered
- 情况说明: certificate added as 证据2; corrected the payment method from
  "POS 刷卡" to Alipay and reconciled the 34-minute gap between the payment
  (15:15:10) and the receipt's 结账时间 (15:49:18); 落款日期 moved to 2026-10-16

Co-Authored-By: Claude Opus 5 <noreply@anthropic.com>
</commit_message>
<xml_diff>
--- a/4-Misc/Legal Disputes/Orthodontics/情况说明.docx
+++ b/4-Misc/Legal Disputes/Orthodontics/情况说明.docx
@@ -84,7 +84,7 @@
           <w:sz w:val="24"/>
           <w:szCs w:val="24"/>
         </w:rPr>
-        <w:t xml:space="preserve">2022年9月18日，说明人在被告经营场所北京市朝阳区东直门外大街12号，向被告购买“INVISALIGN隐适美隐形矫正（复杂版）”牙齿矫正服务，并以POS刷卡方式一次性支付全部服务费人民币29,000元。被告当场向说明人出具《北京薇琳医疗美容医院收费单》，收费单号BL202209180119，结账时间2022年9月18日15时49分18秒。</w:t>
+        <w:t>2022年9月18日，说明人在被告经营场所北京市朝阳区东直门外大街12号，向被告购买“INVISALIGN隐适美隐形矫正（复杂版）”牙齿矫正服务，并于当日15时15分10秒通过本人支付宝账户一次性向被告支付全部服务费人民币29,000元，付款方式为中国邮政储蓄银行储蓄卡（尾号3397）。被告当场向说明人出具《北京薇琳医疗美容医院收费单》，收费单号BL202209180119，收费单载明的结账时间为2022年9月18日15时49分18秒。</w:t>
       </w:r>
     </w:p>
     <w:p>
@@ -170,21 +170,35 @@
           <w:sz w:val="24"/>
           <w:szCs w:val="24"/>
         </w:rPr>
-        <w:t xml:space="preserve">2．说明人与被告员工姜琳琳的微信聊天记录。该员工微信为企业微信账号，所属企业“北京薇琳”（已认证），实名信息为“姜琳琳”，企业地址“北京市朝阳区东直门外大街12号”，与被告住所地一致，足以证明其系代表被告与说明人沟通。聊天记录中，该员工明确表示“您这边2022做的矫正确实时间也很久了”“咱们已经这么多年了，都快结尾了”，直接确认说明人系自2022年起在被告处接受矫正治疗、且服务尚未完成的患者本人。2026年7月5日，说明人已将上述收费单照片通过微信发送给该员工，该员工回复“好滴先生 我这边把情况跟领导沟通一下”，被告自始未对该收费单及说明人的患者身份提出任何异议。</w:t>
-      </w:r>
-    </w:p>
-    <w:p>
-      <w:pPr>
-        <w:ind w:firstLine="480"/>
-        <w:spacing w:line="360" w:lineRule="auto" w:before="0" w:after="120"/>
-      </w:pPr>
-      <w:r>
-        <w:rPr>
-          <w:rFonts w:ascii="Times New Roman" w:eastAsia="宋体" w:hAnsi="Times New Roman"/>
-          <w:sz w:val="24"/>
-          <w:szCs w:val="24"/>
-        </w:rPr>
-        <w:t xml:space="preserve">3．说明人与主治医生张建峰的微信聊天记录。该记录显示张建峰为说明人设计并调整矫正方案，2026年3月29日仍在与说明人确认追加1.2mm片切量以左移上中线，并告知“那就按照片切方案生产了哈，一个月以后下次我们回去复诊再戴牙套”；其亦称“我们5.12去薇琳片切”。前述被告员工姜琳琳在聊天记录中确认张建峰系被告出诊医生（“他现在不全职在这边了”），可与本项记录相互印证。</w:t>
+        <w:t>2．《支付宝交易流水证明》（编号2026101400085004702623844338330072725628）1份，由支付宝支付科技有限公司出具并加盖业务凭证专用章。该证明载明：说明人孙景峰（证件号码220282199405205619）在其支付宝账号790964731@qq.com项下，于2022年9月18日15时15分10秒向“北京薇琳医疗美容医院”支出人民币29,000.00元，付款方式为中国邮政储蓄银行储蓄卡（3397），交易订单号2022091822001444331452866851，商家订单号651266000048180000T6437893120220918151508。该证明与前项收费单所载付款金额29,000元、付款日期2022年9月18日及收款方均完全一致，指向同一笔交易；收费单“结账方式”栏载明的“POS 29000”及结账时间15时49分18秒，系被告在说明人完成上述支付后开具收费单时的记载。该证明由支付宝官方出具并直接载明付款人姓名及证件号码，足以弥补收费单“客户姓名”栏字迹褪色的不足，证明说明人本人系涉案服务费的实际支付人。</w:t>
+      </w:r>
+    </w:p>
+    <w:p>
+      <w:pPr>
+        <w:ind w:firstLine="480"/>
+        <w:spacing w:line="360" w:lineRule="auto" w:before="0" w:after="120"/>
+      </w:pPr>
+      <w:r>
+        <w:rPr>
+          <w:rFonts w:ascii="Times New Roman" w:eastAsia="宋体" w:hAnsi="Times New Roman"/>
+          <w:sz w:val="24"/>
+          <w:szCs w:val="24"/>
+        </w:rPr>
+        <w:t>3．说明人与被告员工姜琳琳的微信聊天记录。该员工微信为企业微信账号，所属企业“北京薇琳”（已认证），实名信息为“姜琳琳”，企业地址“北京市朝阳区东直门外大街12号”，与被告住所地一致，足以证明其系代表被告与说明人沟通。聊天记录中，该员工明确表示“您这边2022做的矫正确实时间也很久了”“咱们已经这么多年了，都快结尾了”，直接确认说明人系自2022年起在被告处接受矫正治疗、且服务尚未完成的患者本人。2026年7月5日，说明人已将上述收费单照片通过微信发送给该员工，该员工回复“好滴先生 我这边把情况跟领导沟通一下”，被告自始未对该收费单及说明人的患者身份提出任何异议。</w:t>
+      </w:r>
+    </w:p>
+    <w:p>
+      <w:pPr>
+        <w:ind w:firstLine="480"/>
+        <w:spacing w:line="360" w:lineRule="auto" w:before="0" w:after="120"/>
+      </w:pPr>
+      <w:r>
+        <w:rPr>
+          <w:rFonts w:ascii="Times New Roman" w:eastAsia="宋体" w:hAnsi="Times New Roman"/>
+          <w:sz w:val="24"/>
+          <w:szCs w:val="24"/>
+        </w:rPr>
+        <w:t>4．说明人与主治医生张建峰的微信聊天记录。该记录显示张建峰为说明人设计并调整矫正方案，2026年3月29日仍在与说明人确认追加1.2mm片切量以左移上中线，并告知“那就按照片切方案生产了哈，一个月以后下次我们回去复诊再戴牙套”；其亦称“我们5.12去薇琳片切”。前述被告员工姜琳琳在聊天记录中确认张建峰系被告出诊医生（“他现在不全职在这边了”），可与本项记录相互印证。</w:t>
       </w:r>
     </w:p>
     <w:p>
@@ -281,7 +295,7 @@
           <w:sz w:val="24"/>
           <w:szCs w:val="24"/>
         </w:rPr>
-        <w:t xml:space="preserve">2026年08月20日</w:t>
+        <w:t>2026年10月16日</w:t>
       </w:r>
     </w:p>
     <w:sectPr>

</xml_diff>